<commit_message>
la til ragnar dialog
</commit_message>
<xml_diff>
--- a/heidis bar intro _ ragnar dialog.docx
+++ b/heidis bar intro _ ragnar dialog.docx
@@ -1636,11 +1636,9 @@
       <w:r>
         <w:t xml:space="preserve"> pull </w:t>
       </w:r>
-      <w:proofErr w:type="gramStart"/>
-      <w:r>
-        <w:t>of</w:t>
-      </w:r>
-      <w:proofErr w:type="gramEnd"/>
+      <w:r>
+        <w:t>off</w:t>
+      </w:r>
       <w:r>
         <w:t xml:space="preserve"> wearing a hat</w:t>
       </w:r>
@@ -1648,8 +1646,6 @@
         <w:t>, but alas, no such hat is on his head.</w:t>
       </w:r>
     </w:p>
-    <w:p/>
-    <w:p/>
     <w:p/>
     <w:p/>
     <w:p>
@@ -1733,7 +1729,13 @@
         <w:t>Apparently,</w:t>
       </w:r>
       <w:r>
-        <w:t xml:space="preserve"> people have fought over control over them for quite some time, </w:t>
+        <w:t xml:space="preserve"> people have fought over control </w:t>
+      </w:r>
+      <w:r>
+        <w:t>of</w:t>
+      </w:r>
+      <w:r>
+        <w:t xml:space="preserve"> them for quite some time, </w:t>
       </w:r>
       <w:r>
         <w:t xml:space="preserve">dueling on top of buildings, ripping </w:t>
@@ -1763,88 +1765,6 @@
       </w:r>
     </w:p>
     <w:p>
-      <w:proofErr w:type="spellStart"/>
-      <w:r>
-        <w:t>Hva</w:t>
-      </w:r>
-      <w:proofErr w:type="spellEnd"/>
-      <w:r>
-        <w:t xml:space="preserve"> er </w:t>
-      </w:r>
-      <w:proofErr w:type="spellStart"/>
-      <w:r>
-        <w:t>egentlig</w:t>
-      </w:r>
-      <w:proofErr w:type="spellEnd"/>
-      <w:r>
-        <w:t xml:space="preserve"> </w:t>
-      </w:r>
-      <w:proofErr w:type="spellStart"/>
-      <w:r>
-        <w:t>greia</w:t>
-      </w:r>
-      <w:proofErr w:type="spellEnd"/>
-      <w:r>
-        <w:t xml:space="preserve"> med det </w:t>
-      </w:r>
-      <w:proofErr w:type="spellStart"/>
-      <w:r>
-        <w:t>svære</w:t>
-      </w:r>
-      <w:proofErr w:type="spellEnd"/>
-      <w:r>
-        <w:t xml:space="preserve"> </w:t>
-      </w:r>
-      <w:proofErr w:type="spellStart"/>
-      <w:r>
-        <w:t>treet</w:t>
-      </w:r>
-      <w:proofErr w:type="spellEnd"/>
-      <w:r>
-        <w:t xml:space="preserve"> </w:t>
-      </w:r>
-      <w:proofErr w:type="spellStart"/>
-      <w:r>
-        <w:t>inne</w:t>
-      </w:r>
-      <w:proofErr w:type="spellEnd"/>
-      <w:r>
-        <w:t xml:space="preserve"> </w:t>
-      </w:r>
-      <w:proofErr w:type="spellStart"/>
-      <w:r>
-        <w:t>i</w:t>
-      </w:r>
-      <w:proofErr w:type="spellEnd"/>
-      <w:r>
-        <w:t xml:space="preserve"> </w:t>
-      </w:r>
-      <w:proofErr w:type="spellStart"/>
-      <w:r>
-        <w:t>bygget</w:t>
-      </w:r>
-      <w:proofErr w:type="spellEnd"/>
-      <w:r>
-        <w:t xml:space="preserve">, </w:t>
-      </w:r>
-      <w:proofErr w:type="spellStart"/>
-      <w:r>
-        <w:t>hva</w:t>
-      </w:r>
-      <w:proofErr w:type="spellEnd"/>
-      <w:r>
-        <w:t xml:space="preserve"> </w:t>
-      </w:r>
-      <w:proofErr w:type="spellStart"/>
-      <w:r>
-        <w:t>betyr</w:t>
-      </w:r>
-      <w:proofErr w:type="spellEnd"/>
-      <w:r>
-        <w:t xml:space="preserve"> det?</w:t>
-      </w:r>
-    </w:p>
-    <w:p>
       <w:r>
         <w:t>[[What’s up with that giant tree?]]</w:t>
       </w:r>
@@ -1868,382 +1788,50 @@
         <w:t xml:space="preserve"> 3 </w:t>
       </w:r>
     </w:p>
-    <w:p>
-      <w:r>
-        <w:t xml:space="preserve">det var </w:t>
-      </w:r>
-      <w:proofErr w:type="spellStart"/>
-      <w:r>
-        <w:t>en</w:t>
-      </w:r>
-      <w:proofErr w:type="spellEnd"/>
-      <w:r>
-        <w:t xml:space="preserve"> gave </w:t>
-      </w:r>
-      <w:proofErr w:type="spellStart"/>
-      <w:r>
-        <w:t>fra</w:t>
-      </w:r>
-      <w:proofErr w:type="spellEnd"/>
-      <w:r>
-        <w:t xml:space="preserve"> </w:t>
-      </w:r>
-      <w:proofErr w:type="spellStart"/>
-      <w:r>
-        <w:t>en</w:t>
-      </w:r>
-      <w:proofErr w:type="spellEnd"/>
-      <w:r>
-        <w:t xml:space="preserve"> </w:t>
-      </w:r>
-      <w:proofErr w:type="spellStart"/>
-      <w:r>
-        <w:t>venn</w:t>
-      </w:r>
-      <w:proofErr w:type="spellEnd"/>
-      <w:r>
-        <w:t xml:space="preserve"> av meg </w:t>
-      </w:r>
-      <w:proofErr w:type="spellStart"/>
-      <w:r>
-        <w:t>langt</w:t>
-      </w:r>
-      <w:proofErr w:type="spellEnd"/>
-      <w:r>
-        <w:t xml:space="preserve"> </w:t>
-      </w:r>
-      <w:proofErr w:type="spellStart"/>
-      <w:r>
-        <w:t>langt</w:t>
-      </w:r>
-      <w:proofErr w:type="spellEnd"/>
-      <w:r>
-        <w:t xml:space="preserve"> </w:t>
-      </w:r>
-      <w:proofErr w:type="spellStart"/>
-      <w:r>
-        <w:t>unna</w:t>
-      </w:r>
-      <w:proofErr w:type="spellEnd"/>
-      <w:r>
-        <w:t xml:space="preserve"> </w:t>
-      </w:r>
-      <w:proofErr w:type="spellStart"/>
-      <w:r>
-        <w:t>fra</w:t>
-      </w:r>
-      <w:proofErr w:type="spellEnd"/>
-      <w:r>
-        <w:t xml:space="preserve"> et </w:t>
-      </w:r>
-      <w:proofErr w:type="spellStart"/>
-      <w:r>
-        <w:t>solfylt</w:t>
-      </w:r>
-      <w:proofErr w:type="spellEnd"/>
-      <w:r>
-        <w:t xml:space="preserve"> </w:t>
-      </w:r>
-      <w:proofErr w:type="spellStart"/>
-      <w:r>
-        <w:t>dystert</w:t>
-      </w:r>
-      <w:proofErr w:type="spellEnd"/>
-      <w:r>
-        <w:t xml:space="preserve"> klippe </w:t>
-      </w:r>
-      <w:proofErr w:type="spellStart"/>
-      <w:r>
-        <w:t>i</w:t>
-      </w:r>
-      <w:proofErr w:type="spellEnd"/>
-      <w:r>
-        <w:t xml:space="preserve"> </w:t>
-      </w:r>
-      <w:proofErr w:type="spellStart"/>
-      <w:r>
-        <w:t>en</w:t>
-      </w:r>
-      <w:proofErr w:type="spellEnd"/>
-      <w:r>
-        <w:t xml:space="preserve"> tom </w:t>
-      </w:r>
-      <w:proofErr w:type="spellStart"/>
-      <w:proofErr w:type="gramStart"/>
-      <w:r>
-        <w:t>landsby</w:t>
-      </w:r>
-      <w:proofErr w:type="spellEnd"/>
-      <w:r>
-        <w:t xml:space="preserve">  </w:t>
-      </w:r>
-      <w:proofErr w:type="spellStart"/>
-      <w:r>
-        <w:t>langs</w:t>
-      </w:r>
-      <w:proofErr w:type="spellEnd"/>
-      <w:proofErr w:type="gramEnd"/>
-      <w:r>
-        <w:t xml:space="preserve"> </w:t>
-      </w:r>
-      <w:proofErr w:type="spellStart"/>
-      <w:r>
-        <w:t>sjøen</w:t>
-      </w:r>
-      <w:proofErr w:type="spellEnd"/>
-      <w:r>
-        <w:t xml:space="preserve">   </w:t>
-      </w:r>
-      <w:proofErr w:type="spellStart"/>
-      <w:r>
-        <w:t>hun</w:t>
-      </w:r>
-      <w:proofErr w:type="spellEnd"/>
-      <w:r>
-        <w:t xml:space="preserve"> var </w:t>
-      </w:r>
-      <w:proofErr w:type="spellStart"/>
-      <w:r>
-        <w:t>syk</w:t>
-      </w:r>
-      <w:proofErr w:type="spellEnd"/>
-      <w:r>
-        <w:t xml:space="preserve"> med </w:t>
-      </w:r>
-      <w:proofErr w:type="spellStart"/>
-      <w:r>
-        <w:t>en</w:t>
-      </w:r>
-      <w:proofErr w:type="spellEnd"/>
-      <w:r>
-        <w:t xml:space="preserve"> </w:t>
-      </w:r>
-      <w:proofErr w:type="spellStart"/>
-      <w:r>
-        <w:t>fryktelig</w:t>
-      </w:r>
-      <w:proofErr w:type="spellEnd"/>
-      <w:r>
-        <w:t xml:space="preserve"> </w:t>
-      </w:r>
-      <w:proofErr w:type="spellStart"/>
-      <w:r>
-        <w:t>sykdom</w:t>
-      </w:r>
-      <w:proofErr w:type="spellEnd"/>
-      <w:r>
-        <w:t xml:space="preserve"> der </w:t>
-      </w:r>
-      <w:proofErr w:type="spellStart"/>
-      <w:r>
-        <w:t>hun</w:t>
-      </w:r>
-      <w:proofErr w:type="spellEnd"/>
-      <w:r>
-        <w:t xml:space="preserve"> </w:t>
-      </w:r>
-      <w:proofErr w:type="spellStart"/>
-      <w:r>
-        <w:t>glemte</w:t>
-      </w:r>
-      <w:proofErr w:type="spellEnd"/>
-      <w:r>
-        <w:t xml:space="preserve"> </w:t>
-      </w:r>
-      <w:proofErr w:type="spellStart"/>
-      <w:r>
-        <w:t>hvem</w:t>
-      </w:r>
-      <w:proofErr w:type="spellEnd"/>
-      <w:r>
-        <w:t xml:space="preserve"> </w:t>
-      </w:r>
-      <w:proofErr w:type="spellStart"/>
-      <w:r>
-        <w:t>hun</w:t>
-      </w:r>
-      <w:proofErr w:type="spellEnd"/>
-      <w:r>
-        <w:t xml:space="preserve"> var, </w:t>
-      </w:r>
-      <w:proofErr w:type="spellStart"/>
-      <w:r>
-        <w:t>hun</w:t>
-      </w:r>
-      <w:proofErr w:type="spellEnd"/>
-      <w:r>
-        <w:t xml:space="preserve"> </w:t>
-      </w:r>
-      <w:proofErr w:type="spellStart"/>
-      <w:r>
-        <w:t>ønsket</w:t>
-      </w:r>
-      <w:proofErr w:type="spellEnd"/>
-      <w:r>
-        <w:t xml:space="preserve"> at </w:t>
-      </w:r>
-      <w:proofErr w:type="spellStart"/>
-      <w:r>
-        <w:t>jeg</w:t>
-      </w:r>
-      <w:proofErr w:type="spellEnd"/>
-      <w:r>
-        <w:t xml:space="preserve"> </w:t>
-      </w:r>
-      <w:proofErr w:type="spellStart"/>
-      <w:r>
-        <w:t>skulle</w:t>
-      </w:r>
-      <w:proofErr w:type="spellEnd"/>
-      <w:r>
-        <w:t xml:space="preserve"> </w:t>
-      </w:r>
-      <w:proofErr w:type="spellStart"/>
-      <w:r>
-        <w:t>huske</w:t>
-      </w:r>
-      <w:proofErr w:type="spellEnd"/>
-      <w:r>
-        <w:t xml:space="preserve"> </w:t>
-      </w:r>
-      <w:proofErr w:type="spellStart"/>
-      <w:r>
-        <w:t>hennes</w:t>
-      </w:r>
-      <w:proofErr w:type="spellEnd"/>
-      <w:r>
-        <w:t xml:space="preserve"> </w:t>
-      </w:r>
-      <w:proofErr w:type="spellStart"/>
-      <w:r>
-        <w:t>navn</w:t>
-      </w:r>
-      <w:proofErr w:type="spellEnd"/>
-      <w:r>
-        <w:t xml:space="preserve"> </w:t>
-      </w:r>
-      <w:proofErr w:type="spellStart"/>
-      <w:r>
-        <w:t>og</w:t>
-      </w:r>
-      <w:proofErr w:type="spellEnd"/>
-      <w:r>
-        <w:t xml:space="preserve"> ga meg </w:t>
-      </w:r>
-      <w:proofErr w:type="spellStart"/>
-      <w:r>
-        <w:t>en</w:t>
-      </w:r>
-      <w:proofErr w:type="spellEnd"/>
-      <w:r>
-        <w:t xml:space="preserve"> </w:t>
-      </w:r>
-      <w:proofErr w:type="spellStart"/>
-      <w:r>
-        <w:t>appelsin</w:t>
-      </w:r>
-      <w:proofErr w:type="spellEnd"/>
-      <w:r>
-        <w:t xml:space="preserve"> </w:t>
-      </w:r>
-      <w:proofErr w:type="spellStart"/>
-      <w:r>
-        <w:t>som</w:t>
-      </w:r>
-      <w:proofErr w:type="spellEnd"/>
-      <w:r>
-        <w:t xml:space="preserve"> et </w:t>
-      </w:r>
-      <w:proofErr w:type="spellStart"/>
-      <w:r>
-        <w:t>minne</w:t>
-      </w:r>
-      <w:proofErr w:type="spellEnd"/>
-      <w:r>
-        <w:t xml:space="preserve"> </w:t>
-      </w:r>
-      <w:proofErr w:type="spellStart"/>
-      <w:r>
-        <w:t>og</w:t>
-      </w:r>
-      <w:proofErr w:type="spellEnd"/>
-      <w:r>
-        <w:t xml:space="preserve"> </w:t>
-      </w:r>
-      <w:proofErr w:type="spellStart"/>
-      <w:r>
-        <w:t>jeg</w:t>
-      </w:r>
-      <w:proofErr w:type="spellEnd"/>
-      <w:r>
-        <w:t xml:space="preserve"> </w:t>
-      </w:r>
-      <w:proofErr w:type="spellStart"/>
-      <w:r>
-        <w:t>ville</w:t>
-      </w:r>
-      <w:proofErr w:type="spellEnd"/>
-      <w:r>
-        <w:t xml:space="preserve"> </w:t>
-      </w:r>
-      <w:proofErr w:type="spellStart"/>
-      <w:r>
-        <w:t>hedre</w:t>
-      </w:r>
-      <w:proofErr w:type="spellEnd"/>
-      <w:r>
-        <w:t xml:space="preserve"> </w:t>
-      </w:r>
-      <w:proofErr w:type="spellStart"/>
-      <w:r>
-        <w:t>hennes</w:t>
-      </w:r>
-      <w:proofErr w:type="spellEnd"/>
-      <w:r>
-        <w:t xml:space="preserve"> </w:t>
-      </w:r>
-      <w:proofErr w:type="spellStart"/>
-      <w:r>
-        <w:t>minne</w:t>
-      </w:r>
-      <w:proofErr w:type="spellEnd"/>
-      <w:r>
-        <w:t xml:space="preserve"> med å ha det </w:t>
-      </w:r>
-      <w:proofErr w:type="spellStart"/>
-      <w:r>
-        <w:t>treet</w:t>
-      </w:r>
-      <w:proofErr w:type="spellEnd"/>
-      <w:r>
-        <w:t xml:space="preserve"> </w:t>
-      </w:r>
-      <w:proofErr w:type="spellStart"/>
-      <w:r>
-        <w:t>i</w:t>
-      </w:r>
-      <w:proofErr w:type="spellEnd"/>
-      <w:r>
-        <w:t xml:space="preserve"> </w:t>
-      </w:r>
-      <w:proofErr w:type="spellStart"/>
-      <w:r>
-        <w:t>hjertet</w:t>
-      </w:r>
-      <w:proofErr w:type="spellEnd"/>
-      <w:r>
-        <w:t xml:space="preserve"> av </w:t>
-      </w:r>
-      <w:proofErr w:type="spellStart"/>
-      <w:r>
-        <w:t>bygget</w:t>
-      </w:r>
-      <w:proofErr w:type="spellEnd"/>
-      <w:r>
-        <w:t xml:space="preserve"> </w:t>
-      </w:r>
-    </w:p>
-    <w:p/>
+    <w:p/>
+    <w:p>
+      <w:r>
+        <w:t>It</w:t>
+      </w:r>
+      <w:r>
+        <w:t xml:space="preserve"> was gift from </w:t>
+      </w:r>
+      <w:r>
+        <w:t>a friend of mine</w:t>
+      </w:r>
+      <w:r>
+        <w:t>, she came</w:t>
+      </w:r>
+      <w:r>
+        <w:t xml:space="preserve"> from a land far </w:t>
+      </w:r>
+      <w:proofErr w:type="spellStart"/>
+      <w:r>
+        <w:t>far</w:t>
+      </w:r>
+      <w:proofErr w:type="spellEnd"/>
+      <w:r>
+        <w:t xml:space="preserve"> away from here</w:t>
+      </w:r>
+      <w:r>
+        <w:t>,</w:t>
+      </w:r>
+      <w:r>
+        <w:t xml:space="preserve"> I met</w:t>
+      </w:r>
+      <w:r>
+        <w:t xml:space="preserve"> her</w:t>
+      </w:r>
+      <w:r>
+        <w:t xml:space="preserve"> in small sunny village overlooking </w:t>
+      </w:r>
+      <w:r>
+        <w:t>the sea from a cliff. She was sick with some disease, forgetting who she was. She made me promise to remember her name, and gave me this orange</w:t>
+      </w:r>
+      <w:r>
+        <w:t xml:space="preserve"> to remember her by, so I grew this tree in the heart of my bar to honor her memory.</w:t>
+      </w:r>
+    </w:p>
     <w:sectPr>
       <w:pgSz w:w="11909" w:h="16834"/>
       <w:pgMar w:top="1440" w:right="1440" w:bottom="1440" w:left="1440" w:header="720" w:footer="720" w:gutter="0"/>

</xml_diff>